<commit_message>
agregando detalles del manual
</commit_message>
<xml_diff>
--- a/documentacion/word/RecepcionElectronica/MU-RE-001-ManualUsuario.docx
+++ b/documentacion/word/RecepcionElectronica/MU-RE-001-ManualUsuario.docx
@@ -414,6 +414,22 @@
     </w:p>
     <w:p>
       <w:pPr>
+        <w:pStyle w:val="ListBullet"/>
+      </w:pPr>
+      <w:r>
+        <w:t>9.1 Cómo registrar un nuevo empleado</w:t>
+      </w:r>
+    </w:p>
+    <w:p>
+      <w:pPr>
+        <w:pStyle w:val="ListBullet"/>
+      </w:pPr>
+      <w:r>
+        <w:t>9.2 Directorio de empleados</w:t>
+      </w:r>
+    </w:p>
+    <w:p>
+      <w:pPr>
         <w:pStyle w:val="ListNumber"/>
       </w:pPr>
       <w:r>
@@ -757,6 +773,14 @@
       </w:r>
       <w:r>
         <w:t xml:space="preserve"> asignado a cada usuario; por ello, es posible que algunas pantallas descritas en este manual no estén disponibles para todos los perfiles.</w:t>
+      </w:r>
+    </w:p>
+    <w:p>
+      <w:pPr>
+        <w:pStyle w:val="ListBullet"/>
+      </w:pPr>
+      <w:r>
+        <w:t>Este manual describe la operación base de Recepción Electrónica. Los módulos opcionales o integraciones, como Contratistas, BioStar, Hikvision, Visitantes Avanzado, Registro Campo o Capacitaciones, se documentan en manuales o documentos de integración separados cuando aplican.</w:t>
       </w:r>
     </w:p>
     <w:p>
@@ -8491,6 +8515,127 @@
       </w:r>
       <w:r>
         <w:t xml:space="preserve"> consulta de empleados registrados.</w:t>
+      </w:r>
+    </w:p>
+    <w:p>
+      <w:pPr>
+        <w:pStyle w:val="Heading3"/>
+      </w:pPr>
+      <w:r/>
+      <w:r>
+        <w:t>9.2 Directorio de empleados</w:t>
+      </w:r>
+    </w:p>
+    <w:p>
+      <w:r>
+        <w:t xml:space="preserve">El </w:t>
+      </w:r>
+      <w:r>
+        <w:rPr>
+          <w:b/>
+        </w:rPr>
+        <w:t>Directorio</w:t>
+      </w:r>
+      <w:r>
+        <w:t xml:space="preserve"> permite consultar empleados registrados sin entrar al flujo completo de administración. Es útil para localizar rápidamente información de contacto, área, puesto o ubicación de una persona interna.</w:t>
+      </w:r>
+    </w:p>
+    <w:p>
+      <w:r>
+        <w:t>&gt; Disponible para perfiles autorizados. La información visible depende de los permisos del usuario y de los datos capturados para cada empleado.</w:t>
+      </w:r>
+    </w:p>
+    <w:p>
+      <w:r>
+        <w:rPr>
+          <w:b/>
+        </w:rPr>
+        <w:t>Uso general del Directorio:</w:t>
+      </w:r>
+    </w:p>
+    <w:p>
+      <w:r>
+        <w:rPr>
+          <w:b/>
+        </w:rPr>
+        <w:t>Paso 1.</w:t>
+      </w:r>
+      <w:r>
+        <w:t xml:space="preserve"> Ingrese a la opción </w:t>
+      </w:r>
+      <w:r>
+        <w:rPr>
+          <w:b/>
+        </w:rPr>
+        <w:t>Directorio</w:t>
+      </w:r>
+      <w:r>
+        <w:t xml:space="preserve"> desde el menú principal.</w:t>
+      </w:r>
+    </w:p>
+    <w:p>
+      <w:r>
+        <w:rPr>
+          <w:b/>
+        </w:rPr>
+        <w:t>Paso 2.</w:t>
+      </w:r>
+      <w:r>
+        <w:t xml:space="preserve"> Use el buscador o los filtros disponibles para localizar al empleado.</w:t>
+      </w:r>
+    </w:p>
+    <w:p>
+      <w:r>
+        <w:rPr>
+          <w:b/>
+        </w:rPr>
+        <w:t>Paso 3.</w:t>
+      </w:r>
+      <w:r>
+        <w:t xml:space="preserve"> Revise la información mostrada en la tabla o tarjeta de resultados.</w:t>
+      </w:r>
+    </w:p>
+    <w:p>
+      <w:r>
+        <w:rPr>
+          <w:b/>
+        </w:rPr>
+        <w:t>Paso 4.</w:t>
+      </w:r>
+      <w:r>
+        <w:t xml:space="preserve"> Si necesita modificar información, hágalo desde el módulo </w:t>
+      </w:r>
+      <w:r>
+        <w:rPr>
+          <w:b/>
+        </w:rPr>
+        <w:t>Empleados</w:t>
+      </w:r>
+      <w:r>
+        <w:t>, siempre que su perfil tenga permiso de edición.</w:t>
+      </w:r>
+    </w:p>
+    <w:p>
+      <w:r>
+        <w:t xml:space="preserve">&gt; </w:t>
+      </w:r>
+      <w:r>
+        <w:rPr>
+          <w:b/>
+        </w:rPr>
+        <w:t>Nota:</w:t>
+      </w:r>
+      <w:r>
+        <w:t xml:space="preserve"> El Directorio es principalmente de consulta. Para altas, bajas, activación, inactivación o cambios de datos, utilice el módulo </w:t>
+      </w:r>
+      <w:r>
+        <w:rPr>
+          <w:b/>
+        </w:rPr>
+        <w:t>Empleados</w:t>
+      </w:r>
+      <w:r>
+        <w:t>.</w:t>
       </w:r>
     </w:p>
     <w:p>

</xml_diff>